<commit_message>
docs: fix week-4/5-6 Word reports from M=30 benchmark CSVs
Replace smoke-test figures and hardcoded IDBO numbers with results from
1080 official runs (6 functions x 3 dims x 30 seeds x DBO/IDBO).

Week 4: drop the duplicate cover, embed DBO-only W4-F1/W4-F2 (dim=10,
500 iterations, all 6 functions), keep the 18-row table.
Week 5-6: add an IDBO flowchart image; rebuild BaoCao_Tuan5_6.docx so
winner labels, n_evaluations, F1-F3, and the five protocol answers
match the CSV (18/18 hoa; Rastrigin diversity stays above 1e-3).
</commit_message>
<xml_diff>
--- a/docs/Phan_Cuong_Tuan5_6_IDBO.docx
+++ b/docs/Phan_Cuong_Tuan5_6_IDBO.docx
@@ -803,6 +803,45 @@
     </w:p>
     <w:p>
       <w:pPr>
+        <w:jc w:val="center"/>
+      </w:pPr>
+      <w:r>
+        <w:drawing>
+          <wp:inline xmlns:a="http://schemas.openxmlformats.org/drawingml/2006/main" xmlns:pic="http://schemas.openxmlformats.org/drawingml/2006/picture">
+            <wp:extent cx="4937760" cy="6233451"/>
+            <wp:docPr id="1" name="Picture 1"/>
+            <wp:cNvGraphicFramePr>
+              <a:graphicFrameLocks noChangeAspect="1"/>
+            </wp:cNvGraphicFramePr>
+            <a:graphic>
+              <a:graphicData uri="http://schemas.openxmlformats.org/drawingml/2006/picture">
+                <pic:pic>
+                  <pic:nvPicPr>
+                    <pic:cNvPr id="0" name="fig_idbo_flowchart.png"/>
+                    <pic:cNvPicPr/>
+                  </pic:nvPicPr>
+                  <pic:blipFill>
+                    <a:blip r:embed="rId9"/>
+                    <a:stretch>
+                      <a:fillRect/>
+                    </a:stretch>
+                  </pic:blipFill>
+                  <pic:spPr>
+                    <a:xfrm>
+                      <a:off x="0" y="0"/>
+                      <a:ext cx="4937760" cy="6233451"/>
+                    </a:xfrm>
+                    <a:prstGeom prst="rect"/>
+                  </pic:spPr>
+                </pic:pic>
+              </a:graphicData>
+            </a:graphic>
+          </wp:inline>
+        </w:drawing>
+      </w:r>
+    </w:p>
+    <w:p>
+      <w:pPr>
         <w:pStyle w:val="Heading2"/>
       </w:pPr>
       <w:r>

</xml_diff>